<commit_message>
Leaderboard for ESG with shorten
</commit_message>
<xml_diff>
--- a/notebooks/esg/Team_Report.docx
+++ b/notebooks/esg/Team_Report.docx
@@ -83,7 +83,7 @@
           <w:kern w:val="0"/>
           <w:lang w:eastAsia="en-GB"/>
         </w:rPr>
-        <w:pict w14:anchorId="695D27CD">
+        <w:pict w14:anchorId="561D8E02">
           <v:rect id="_x0000_i1027" alt="" style="width:451.3pt;height:.05pt;mso-width-percent:0;mso-height-percent:0;mso-width-percent:0;mso-height-percent:0" o:hralign="center" o:hrstd="t" o:hr="t" fillcolor="#a0a0a0" stroked="f"/>
         </w:pict>
       </w:r>
@@ -149,7 +149,29 @@
           <w:lang w:eastAsia="en-GB"/>
           <w14:ligatures w14:val="none"/>
         </w:rPr>
-        <w:t>(~150–250 words)</w:t>
+        <w:t>(~50–</w:t>
+      </w:r>
+      <w:r>
+        <w:rPr>
+          <w:rFonts w:ascii="Times New Roman" w:eastAsia="Times New Roman" w:hAnsi="Times New Roman" w:cs="Times New Roman"/>
+          <w:i/>
+          <w:iCs/>
+          <w:kern w:val="0"/>
+          <w:lang w:eastAsia="en-GB"/>
+          <w14:ligatures w14:val="none"/>
+        </w:rPr>
+        <w:t>1</w:t>
+      </w:r>
+      <w:r>
+        <w:rPr>
+          <w:rFonts w:ascii="Times New Roman" w:eastAsia="Times New Roman" w:hAnsi="Times New Roman" w:cs="Times New Roman"/>
+          <w:i/>
+          <w:iCs/>
+          <w:kern w:val="0"/>
+          <w:lang w:eastAsia="en-GB"/>
+          <w14:ligatures w14:val="none"/>
+        </w:rPr>
+        <w:t>50 words)</w:t>
       </w:r>
     </w:p>
     <w:p>
@@ -169,7 +191,7 @@
           <w:kern w:val="0"/>
           <w:lang w:eastAsia="en-GB"/>
         </w:rPr>
-        <w:pict w14:anchorId="0EFB0675">
+        <w:pict w14:anchorId="68C6BD72">
           <v:rect id="_x0000_i1026" alt="" style="width:451.3pt;height:.05pt;mso-width-percent:0;mso-height-percent:0;mso-width-percent:0;mso-height-percent:0" o:hralign="center" o:hrstd="t" o:hr="t" fillcolor="#a0a0a0" stroked="f"/>
         </w:pict>
       </w:r>
@@ -235,7 +257,29 @@
           <w:lang w:eastAsia="en-GB"/>
           <w14:ligatures w14:val="none"/>
         </w:rPr>
-        <w:t>(~100–200 words)</w:t>
+        <w:t>(~50–</w:t>
+      </w:r>
+      <w:r>
+        <w:rPr>
+          <w:rFonts w:ascii="Times New Roman" w:eastAsia="Times New Roman" w:hAnsi="Times New Roman" w:cs="Times New Roman"/>
+          <w:i/>
+          <w:iCs/>
+          <w:kern w:val="0"/>
+          <w:lang w:eastAsia="en-GB"/>
+          <w14:ligatures w14:val="none"/>
+        </w:rPr>
+        <w:t>1</w:t>
+      </w:r>
+      <w:r>
+        <w:rPr>
+          <w:rFonts w:ascii="Times New Roman" w:eastAsia="Times New Roman" w:hAnsi="Times New Roman" w:cs="Times New Roman"/>
+          <w:i/>
+          <w:iCs/>
+          <w:kern w:val="0"/>
+          <w:lang w:eastAsia="en-GB"/>
+          <w14:ligatures w14:val="none"/>
+        </w:rPr>
+        <w:t>50 words)</w:t>
       </w:r>
     </w:p>
     <w:p>
@@ -255,7 +299,7 @@
           <w:kern w:val="0"/>
           <w:lang w:eastAsia="en-GB"/>
         </w:rPr>
-        <w:pict w14:anchorId="2487EFDD">
+        <w:pict w14:anchorId="62707691">
           <v:rect id="_x0000_i1025" alt="" style="width:451.3pt;height:.05pt;mso-width-percent:0;mso-height-percent:0;mso-width-percent:0;mso-height-percent:0" o:hralign="center" o:hrstd="t" o:hr="t" fillcolor="#a0a0a0" stroked="f"/>
         </w:pict>
       </w:r>
@@ -321,7 +365,29 @@
           <w:lang w:eastAsia="en-GB"/>
           <w14:ligatures w14:val="none"/>
         </w:rPr>
-        <w:t>(~100–150 words)</w:t>
+        <w:t>(~50–</w:t>
+      </w:r>
+      <w:r>
+        <w:rPr>
+          <w:rFonts w:ascii="Times New Roman" w:eastAsia="Times New Roman" w:hAnsi="Times New Roman" w:cs="Times New Roman"/>
+          <w:i/>
+          <w:iCs/>
+          <w:kern w:val="0"/>
+          <w:lang w:eastAsia="en-GB"/>
+          <w14:ligatures w14:val="none"/>
+        </w:rPr>
+        <w:t>1</w:t>
+      </w:r>
+      <w:r>
+        <w:rPr>
+          <w:rFonts w:ascii="Times New Roman" w:eastAsia="Times New Roman" w:hAnsi="Times New Roman" w:cs="Times New Roman"/>
+          <w:i/>
+          <w:iCs/>
+          <w:kern w:val="0"/>
+          <w:lang w:eastAsia="en-GB"/>
+          <w14:ligatures w14:val="none"/>
+        </w:rPr>
+        <w:t>50 words)</w:t>
       </w:r>
     </w:p>
     <w:p>

</xml_diff>